<commit_message>
Added GitHub repository link to project report
</commit_message>
<xml_diff>
--- a/Minor_Project_Report_AI_Barber_Shop.docx
+++ b/Minor_Project_Report_AI_Barber_Shop.docx
@@ -273,7 +273,23 @@
           <w:bCs/>
           <w:color w:val="000000"/>
         </w:rPr>
-        <w:t>Ipsita Hota</w:t>
+        <w:t>Ipsit</w:t>
+      </w:r>
+      <w:r>
+        <w:rPr>
+          <w:b/>
+          <w:bCs/>
+          <w:color w:val="000000"/>
+        </w:rPr>
+        <w:t>a Ankita</w:t>
+      </w:r>
+      <w:r>
+        <w:rPr>
+          <w:b/>
+          <w:bCs/>
+          <w:color w:val="000000"/>
+        </w:rPr>
+        <w:t xml:space="preserve"> Hota</w:t>
       </w:r>
     </w:p>
     <w:p>
@@ -447,7 +463,7 @@
           <w:sz w:val="36"/>
           <w:szCs w:val="36"/>
         </w:rPr>
-        <w:t>Ipsita Hota</w:t>
+        <w:t>Ipsita</w:t>
       </w:r>
       <w:r>
         <w:rPr>
@@ -457,7 +473,7 @@
           <w:sz w:val="36"/>
           <w:szCs w:val="36"/>
         </w:rPr>
-        <w:tab/>
+        <w:t xml:space="preserve"> Ankita</w:t>
       </w:r>
       <w:r>
         <w:rPr>
@@ -467,6 +483,17 @@
           <w:sz w:val="36"/>
           <w:szCs w:val="36"/>
         </w:rPr>
+        <w:t xml:space="preserve"> Hota</w:t>
+      </w:r>
+      <w:r>
+        <w:rPr>
+          <w:b/>
+          <w:bCs/>
+          <w:color w:val="000000"/>
+          <w:sz w:val="36"/>
+          <w:szCs w:val="36"/>
+        </w:rPr>
+        <w:tab/>
         <w:t>Sambhu Prasad Panda</w:t>
       </w:r>
     </w:p>
@@ -482,6 +509,7 @@
           <w:b/>
           <w:bCs/>
           <w:color w:val="000000"/>
+          <w:u w:val="single"/>
         </w:rPr>
         <w:t>Project Guide</w:t>
       </w:r>
@@ -492,6 +520,14 @@
           <w:color w:val="000000"/>
         </w:rPr>
         <w:tab/>
+      </w:r>
+      <w:r>
+        <w:rPr>
+          <w:b/>
+          <w:bCs/>
+          <w:color w:val="000000"/>
+          <w:u w:val="single"/>
+        </w:rPr>
         <w:t>Head of Department</w:t>
       </w:r>
     </w:p>
@@ -651,12 +687,6 @@
         <w:gridCol w:w="1240"/>
       </w:tblGrid>
       <w:tr>
-        <w:tblPrEx>
-          <w:tblCellMar>
-            <w:top w:w="0" w:type="dxa"/>
-            <w:bottom w:w="0" w:type="dxa"/>
-          </w:tblCellMar>
-        </w:tblPrEx>
         <w:tc>
           <w:tcPr>
             <w:tcW w:w="800" w:type="dxa"/>
@@ -751,12 +781,6 @@
         </w:tc>
       </w:tr>
       <w:tr>
-        <w:tblPrEx>
-          <w:tblCellMar>
-            <w:top w:w="0" w:type="dxa"/>
-            <w:bottom w:w="0" w:type="dxa"/>
-          </w:tblCellMar>
-        </w:tblPrEx>
         <w:tc>
           <w:tcPr>
             <w:tcW w:w="800" w:type="dxa"/>
@@ -839,12 +863,6 @@
         </w:tc>
       </w:tr>
       <w:tr>
-        <w:tblPrEx>
-          <w:tblCellMar>
-            <w:top w:w="0" w:type="dxa"/>
-            <w:bottom w:w="0" w:type="dxa"/>
-          </w:tblCellMar>
-        </w:tblPrEx>
         <w:tc>
           <w:tcPr>
             <w:tcW w:w="800" w:type="dxa"/>
@@ -927,12 +945,6 @@
         </w:tc>
       </w:tr>
       <w:tr>
-        <w:tblPrEx>
-          <w:tblCellMar>
-            <w:top w:w="0" w:type="dxa"/>
-            <w:bottom w:w="0" w:type="dxa"/>
-          </w:tblCellMar>
-        </w:tblPrEx>
         <w:tc>
           <w:tcPr>
             <w:tcW w:w="800" w:type="dxa"/>
@@ -1015,12 +1027,6 @@
         </w:tc>
       </w:tr>
       <w:tr>
-        <w:tblPrEx>
-          <w:tblCellMar>
-            <w:top w:w="0" w:type="dxa"/>
-            <w:bottom w:w="0" w:type="dxa"/>
-          </w:tblCellMar>
-        </w:tblPrEx>
         <w:tc>
           <w:tcPr>
             <w:tcW w:w="800" w:type="dxa"/>
@@ -1103,12 +1109,6 @@
         </w:tc>
       </w:tr>
       <w:tr>
-        <w:tblPrEx>
-          <w:tblCellMar>
-            <w:top w:w="0" w:type="dxa"/>
-            <w:bottom w:w="0" w:type="dxa"/>
-          </w:tblCellMar>
-        </w:tblPrEx>
         <w:tc>
           <w:tcPr>
             <w:tcW w:w="800" w:type="dxa"/>
@@ -1191,12 +1191,6 @@
         </w:tc>
       </w:tr>
       <w:tr>
-        <w:tblPrEx>
-          <w:tblCellMar>
-            <w:top w:w="0" w:type="dxa"/>
-            <w:bottom w:w="0" w:type="dxa"/>
-          </w:tblCellMar>
-        </w:tblPrEx>
         <w:tc>
           <w:tcPr>
             <w:tcW w:w="800" w:type="dxa"/>
@@ -1279,12 +1273,6 @@
         </w:tc>
       </w:tr>
       <w:tr>
-        <w:tblPrEx>
-          <w:tblCellMar>
-            <w:top w:w="0" w:type="dxa"/>
-            <w:bottom w:w="0" w:type="dxa"/>
-          </w:tblCellMar>
-        </w:tblPrEx>
         <w:tc>
           <w:tcPr>
             <w:tcW w:w="800" w:type="dxa"/>
@@ -1367,12 +1355,6 @@
         </w:tc>
       </w:tr>
       <w:tr>
-        <w:tblPrEx>
-          <w:tblCellMar>
-            <w:top w:w="0" w:type="dxa"/>
-            <w:bottom w:w="0" w:type="dxa"/>
-          </w:tblCellMar>
-        </w:tblPrEx>
         <w:tc>
           <w:tcPr>
             <w:tcW w:w="800" w:type="dxa"/>
@@ -1455,12 +1437,6 @@
         </w:tc>
       </w:tr>
       <w:tr>
-        <w:tblPrEx>
-          <w:tblCellMar>
-            <w:top w:w="0" w:type="dxa"/>
-            <w:bottom w:w="0" w:type="dxa"/>
-          </w:tblCellMar>
-        </w:tblPrEx>
         <w:tc>
           <w:tcPr>
             <w:tcW w:w="800" w:type="dxa"/>
@@ -1543,12 +1519,6 @@
         </w:tc>
       </w:tr>
       <w:tr>
-        <w:tblPrEx>
-          <w:tblCellMar>
-            <w:top w:w="0" w:type="dxa"/>
-            <w:bottom w:w="0" w:type="dxa"/>
-          </w:tblCellMar>
-        </w:tblPrEx>
         <w:tc>
           <w:tcPr>
             <w:tcW w:w="800" w:type="dxa"/>
@@ -1631,12 +1601,6 @@
         </w:tc>
       </w:tr>
       <w:tr>
-        <w:tblPrEx>
-          <w:tblCellMar>
-            <w:top w:w="0" w:type="dxa"/>
-            <w:bottom w:w="0" w:type="dxa"/>
-          </w:tblCellMar>
-        </w:tblPrEx>
         <w:tc>
           <w:tcPr>
             <w:tcW w:w="800" w:type="dxa"/>
@@ -9760,14 +9724,47 @@
     <w:p>
       <w:pPr>
         <w:spacing w:before="80" w:after="80"/>
-      </w:pPr>
-      <w:r>
         <w:rPr>
           <w:b/>
           <w:bCs/>
           <w:color w:val="000000"/>
         </w:rPr>
+      </w:pPr>
+      <w:r>
+        <w:rPr>
+          <w:b/>
+          <w:bCs/>
+          <w:color w:val="000000"/>
+        </w:rPr>
         <w:t>Repository URL:</w:t>
+      </w:r>
+    </w:p>
+    <w:p>
+      <w:pPr>
+        <w:spacing w:before="80" w:after="80"/>
+        <w:rPr>
+          <w:b/>
+          <w:bCs/>
+          <w:color w:val="000000"/>
+        </w:rPr>
+      </w:pPr>
+    </w:p>
+    <w:p>
+      <w:pPr>
+        <w:spacing w:before="80" w:after="80"/>
+        <w:rPr>
+          <w:rFonts w:ascii="Arial Nova" w:hAnsi="Arial Nova"/>
+          <w:sz w:val="36"/>
+          <w:szCs w:val="36"/>
+        </w:rPr>
+      </w:pPr>
+      <w:r>
+        <w:rPr>
+          <w:rFonts w:ascii="Arial Nova" w:hAnsi="Arial Nova"/>
+          <w:sz w:val="36"/>
+          <w:szCs w:val="36"/>
+        </w:rPr>
+        <w:t>https://github.com/Aritnatic/AI-Barber-Shop-Receptionist</w:t>
       </w:r>
     </w:p>
     <w:p>
@@ -10064,13 +10061,7 @@
         <w:rPr>
           <w:color w:val="000000"/>
         </w:rPr>
-        <w:t>6</w:t>
-      </w:r>
-      <w:r>
-        <w:rPr>
-          <w:color w:val="000000"/>
-        </w:rPr>
-        <w:t>. SMS Gateway Android App. "API Documentation." https://sms-gate.app/api</w:t>
+        <w:t>6. SMS Gateway Android App. "API Documentation." https://sms-gate.app/api</w:t>
       </w:r>
     </w:p>
     <w:sectPr>

</xml_diff>